<commit_message>
update ACHMITECH Logo on DC
</commit_message>
<xml_diff>
--- a/achmitech_hr_recruitment/static/src/docx/dca_simplified_template.docx
+++ b/achmitech_hr_recruitment/static/src/docx/dca_simplified_template.docx
@@ -22,8 +22,8 @@
         <w:tblLook w:val="0480" w:firstRow="0" w:lastRow="0" w:firstColumn="1" w:lastColumn="0" w:noHBand="0" w:noVBand="1"/>
       </w:tblPr>
       <w:tblGrid>
-        <w:gridCol w:w="8439"/>
-        <w:gridCol w:w="1482"/>
+        <w:gridCol w:w="8373"/>
+        <w:gridCol w:w="1548"/>
       </w:tblGrid>
       <w:tr>
         <w:tc>
@@ -166,13 +166,12 @@
             <w:r>
               <w:rPr>
                 <w:noProof/>
-                <w:lang w:val="fr-FR"/>
               </w:rPr>
               <w:drawing>
-                <wp:inline distT="0" distB="0" distL="0" distR="0" wp14:anchorId="15D3CD4E" wp14:editId="7977F622">
-                  <wp:extent cx="857250" cy="919439"/>
+                <wp:inline distT="0" distB="0" distL="0" distR="0" wp14:anchorId="080967E8" wp14:editId="33059754">
+                  <wp:extent cx="914400" cy="914400"/>
                   <wp:effectExtent l="0" t="0" r="0" b="0"/>
-                  <wp:docPr id="1" name="Picture 1" descr="C:\Users\rabat\Downloads\achmitech_logo.jpg"/>
+                  <wp:docPr id="2123376866" name="Image 4"/>
                   <wp:cNvGraphicFramePr>
                     <a:graphicFrameLocks xmlns:a="http://schemas.openxmlformats.org/drawingml/2006/main" noChangeAspect="1"/>
                   </wp:cNvGraphicFramePr>
@@ -180,7 +179,7 @@
                     <a:graphicData uri="http://schemas.openxmlformats.org/drawingml/2006/picture">
                       <pic:pic xmlns:pic="http://schemas.openxmlformats.org/drawingml/2006/picture">
                         <pic:nvPicPr>
-                          <pic:cNvPr id="0" name="Picture 5" descr="C:\Users\rabat\Downloads\achmitech_logo.jpg"/>
+                          <pic:cNvPr id="0" name="Picture 5"/>
                           <pic:cNvPicPr>
                             <a:picLocks noChangeAspect="1" noChangeArrowheads="1"/>
                           </pic:cNvPicPr>
@@ -201,7 +200,7 @@
                         <pic:spPr bwMode="auto">
                           <a:xfrm>
                             <a:off x="0" y="0"/>
-                            <a:ext cx="890379" cy="954971"/>
+                            <a:ext cx="914400" cy="914400"/>
                           </a:xfrm>
                           <a:prstGeom prst="rect">
                             <a:avLst/>
@@ -398,7 +397,7 @@
               </wp:anchor>
             </w:drawing>
           </mc:Choice>
-          <mc:Fallback xmlns:a14="http://schemas.microsoft.com/office/drawing/2010/main" xmlns:a="http://schemas.openxmlformats.org/drawingml/2006/main">
+          <mc:Fallback xmlns:a="http://schemas.openxmlformats.org/drawingml/2006/main" xmlns:a14="http://schemas.microsoft.com/office/drawing/2010/main">
             <w:pict>
               <v:group id="Zone de dessin 6" style="position:absolute;margin-left:.1pt;margin-top:4pt;width:496.15pt;height:14.85pt;z-index:-251657216" coordsize="63011,1885" o:spid="_x0000_s1026" editas="canvas" w14:anchorId="316664EE" o:gfxdata="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">
                 <v:shape id="_x0000_s1027" style="position:absolute;width:63011;height:1885;visibility:visible;mso-wrap-style:square" type="#_x0000_t75">
@@ -17082,15 +17081,6 @@
 </file>
 
 <file path=customXml/item1.xml><?xml version="1.0" encoding="utf-8"?>
-<?mso-contentType ?>
-<FormTemplates xmlns="http://schemas.microsoft.com/sharepoint/v3/contenttype/forms">
-  <Display>DocumentLibraryForm</Display>
-  <Edit>DocumentLibraryForm</Edit>
-  <New>DocumentLibraryForm</New>
-</FormTemplates>
-</file>
-
-<file path=customXml/item2.xml><?xml version="1.0" encoding="utf-8"?>
 <ct:contentTypeSchema xmlns:ct="http://schemas.microsoft.com/office/2006/metadata/contentType" xmlns:ma="http://schemas.microsoft.com/office/2006/metadata/properties/metaAttributes" ct:_="" ma:_="" ma:contentTypeName="Document" ma:contentTypeID="0x010100A3CA1B408E8E4B4FBAE07298AB85BDD0" ma:contentTypeVersion="2" ma:contentTypeDescription="Create a new document." ma:contentTypeScope="" ma:versionID="54f07e138cd7ab2e06fdbd1c3522eb9c">
   <xsd:schema xmlns:xsd="http://www.w3.org/2001/XMLSchema" xmlns:p="http://schemas.microsoft.com/office/2006/metadata/properties" xmlns:ns2="594baba4-ddf1-4441-b192-378ce97d7503" targetNamespace="http://schemas.microsoft.com/office/2006/metadata/properties" ma:root="true" ma:fieldsID="fbd22ef19c19cc1cd549d114b6f459ef" ns2:_="">
     <xsd:import namespace="594baba4-ddf1-4441-b192-378ce97d7503"/>
@@ -17152,23 +17142,24 @@
 </ct:contentTypeSchema>
 </file>
 
+<file path=customXml/item2.xml><?xml version="1.0" encoding="utf-8"?>
+<?mso-contentType ?>
+<FormTemplates xmlns="http://schemas.microsoft.com/sharepoint/v3/contenttype/forms">
+  <Display>DocumentLibraryForm</Display>
+  <Edit>DocumentLibraryForm</Edit>
+  <New>DocumentLibraryForm</New>
+</FormTemplates>
+</file>
+
 <file path=customXml/item3.xml><?xml version="1.0" encoding="utf-8"?>
+<b:Sources xmlns:b="http://schemas.openxmlformats.org/officeDocument/2006/bibliography" xmlns="http://schemas.openxmlformats.org/officeDocument/2006/bibliography" SelectedStyle="\APA.XSL" StyleName="APA"/>
+</file>
+
+<file path=customXml/item4.xml><?xml version="1.0" encoding="utf-8"?>
 <LongProperties xmlns="http://schemas.microsoft.com/office/2006/metadata/longProperties"/>
 </file>
 
-<file path=customXml/item4.xml><?xml version="1.0" encoding="utf-8"?>
-<b:Sources xmlns:b="http://schemas.openxmlformats.org/officeDocument/2006/bibliography" xmlns="http://schemas.openxmlformats.org/officeDocument/2006/bibliography" SelectedStyle="\APA.XSL" StyleName="APA"/>
-</file>
-
 <file path=customXml/itemProps1.xml><?xml version="1.0" encoding="utf-8"?>
-<ds:datastoreItem xmlns:ds="http://schemas.openxmlformats.org/officeDocument/2006/customXml" ds:itemID="{BECD7B25-234A-48C9-B7A9-A41EEFC8D1DD}">
-  <ds:schemaRefs>
-    <ds:schemaRef ds:uri="http://schemas.microsoft.com/sharepoint/v3/contenttype/forms"/>
-  </ds:schemaRefs>
-</ds:datastoreItem>
-</file>
-
-<file path=customXml/itemProps2.xml><?xml version="1.0" encoding="utf-8"?>
 <ds:datastoreItem xmlns:ds="http://schemas.openxmlformats.org/officeDocument/2006/customXml" ds:itemID="{167D7672-4853-491D-B255-EA33F9C4D2DB}">
   <ds:schemaRefs>
     <ds:schemaRef ds:uri="http://schemas.microsoft.com/office/2006/metadata/contentType"/>
@@ -17185,18 +17176,26 @@
 </ds:datastoreItem>
 </file>
 
+<file path=customXml/itemProps2.xml><?xml version="1.0" encoding="utf-8"?>
+<ds:datastoreItem xmlns:ds="http://schemas.openxmlformats.org/officeDocument/2006/customXml" ds:itemID="{BECD7B25-234A-48C9-B7A9-A41EEFC8D1DD}">
+  <ds:schemaRefs>
+    <ds:schemaRef ds:uri="http://schemas.microsoft.com/sharepoint/v3/contenttype/forms"/>
+  </ds:schemaRefs>
+</ds:datastoreItem>
+</file>
+
 <file path=customXml/itemProps3.xml><?xml version="1.0" encoding="utf-8"?>
+<ds:datastoreItem xmlns:ds="http://schemas.openxmlformats.org/officeDocument/2006/customXml" ds:itemID="{4DE37044-D4A5-453A-BFB2-A5B66DE09728}">
+  <ds:schemaRefs>
+    <ds:schemaRef ds:uri="http://schemas.openxmlformats.org/officeDocument/2006/bibliography"/>
+  </ds:schemaRefs>
+</ds:datastoreItem>
+</file>
+
+<file path=customXml/itemProps4.xml><?xml version="1.0" encoding="utf-8"?>
 <ds:datastoreItem xmlns:ds="http://schemas.openxmlformats.org/officeDocument/2006/customXml" ds:itemID="{647C7A8F-9755-42A0-844B-4AD918516A30}">
   <ds:schemaRefs>
     <ds:schemaRef ds:uri="http://schemas.microsoft.com/office/2006/metadata/longProperties"/>
   </ds:schemaRefs>
 </ds:datastoreItem>
-</file>
-
-<file path=customXml/itemProps4.xml><?xml version="1.0" encoding="utf-8"?>
-<ds:datastoreItem xmlns:ds="http://schemas.openxmlformats.org/officeDocument/2006/customXml" ds:itemID="{4DE37044-D4A5-453A-BFB2-A5B66DE09728}">
-  <ds:schemaRefs>
-    <ds:schemaRef ds:uri="http://schemas.openxmlformats.org/officeDocument/2006/bibliography"/>
-  </ds:schemaRefs>
-</ds:datastoreItem>
 </file>
</xml_diff>